<commit_message>
CAR Varones mobiliario: verificación por texto con etiquetas anidadas en bloques; proyector E7 = 4
Co-Authored-By: Claude Opus 5.5 <noreply@anthropic.com>
Claude-Session: https://claude.ai/code/session_0142t8T16igb3VKxUPwnQPq6
</commit_message>
<xml_diff>
--- a/entregables_varones/ESPECIFICACIONES_TECNICAS_EQUIPAMIENTO_Y_MOBILIARIO_CAR_VARONES.docx
+++ b/entregables_varones/ESPECIFICACIONES_TECNICAS_EQUIPAMIENTO_Y_MOBILIARIO_CAR_VARONES.docx
@@ -1614,7 +1614,7 @@
                 <w:sz w:val="17"/>
                 <w:szCs w:val="17"/>
               </w:rPr>
-              <w:t xml:space="preserve">3</w:t>
+              <w:t xml:space="preserve">4</w:t>
             </w:r>
           </w:p>
         </w:tc>
@@ -15256,21 +15256,21 @@
           <w:sz w:val="20"/>
           <w:szCs w:val="20"/>
         </w:rPr>
-        <w:t xml:space="preserve">Comprende el suministro, el transporte, el armado y la instalación de proyector multimedia, con las características de esta especificación, en los ambientes indicados en las láminas MB-01 a MB-09. Cantidad del metrado: 3 und.</w:t>
-      </w:r>
-    </w:p>
-    <w:p>
-      <w:pPr>
-        <w:spacing w:after="100" w:before="0" w:line="276"/>
-        <w:jc w:val="both"/>
-      </w:pPr>
-      <w:r>
-        <w:rPr>
-          <w:rFonts w:ascii="Arial" w:cs="Arial" w:eastAsia="Arial" w:hAnsi="Arial"/>
-          <w:sz w:val="20"/>
-          <w:szCs w:val="20"/>
-        </w:rPr>
-        <w:t xml:space="preserve">Ubicación: E-01 Consultorio de nutricion (1); E-01 Sala de reuniones (1); E-08 Sum/comedor - depósito (1).</w:t>
+        <w:t xml:space="preserve">Comprende el suministro, el transporte, el armado y la instalación de proyector multimedia, con las características de esta especificación, en los ambientes indicados en las láminas MB-01 a MB-09. Cantidad del metrado: 4 und.</w:t>
+      </w:r>
+    </w:p>
+    <w:p>
+      <w:pPr>
+        <w:spacing w:after="100" w:before="0" w:line="276"/>
+        <w:jc w:val="both"/>
+      </w:pPr>
+      <w:r>
+        <w:rPr>
+          <w:rFonts w:ascii="Arial" w:cs="Arial" w:eastAsia="Arial" w:hAnsi="Arial"/>
+          <w:sz w:val="20"/>
+          <w:szCs w:val="20"/>
+        </w:rPr>
+        <w:t xml:space="preserve">Ubicación: E-01 Consultorio de nutricion (1); E-01 Sala de reuniones (1); E-01 Topico (1); E-08 Sum/comedor - depósito (1).</w:t>
       </w:r>
     </w:p>
     <w:p>

</xml_diff>